<commit_message>
Update target submission journal to Journal of Information Security and Applications (JISA) across all cover letters, title pages, declarations, scripts, and bibliography files
</commit_message>
<xml_diff>
--- a/submission/TURRET-OS_Declaration_of_Competing_Interests.docx
+++ b/submission/TURRET-OS_Declaration_of_Competing_Interests.docx
@@ -17,7 +17,7 @@
     </w:p>
     <w:p>
       <w:r>
-        <w:t>Target Journal: Computers &amp; Security (Elsevier)</w:t>
+        <w:t>Target Journal: Journal of Information Security and Applications (Elsevier)</w:t>
       </w:r>
     </w:p>
     <w:p>
@@ -30,7 +30,7 @@
     </w:p>
     <w:p>
       <w:r>
-        <w:t>I confirm that no authors of this manuscript have any competing financial or non-financial interests, currently or previously, including serving in an editorial capacity for the journal we are submitting to (Computers &amp; Security).</w:t>
+        <w:t>I confirm that no authors of this manuscript have any competing financial or non-financial interests, currently or previously, including serving in an editorial capacity for the journal we are submitting to (Journal of Information Security and Applications).</w:t>
       </w:r>
     </w:p>
     <w:p>

</xml_diff>